<commit_message>
docs(brief): add origin/requirements from master + fork deviations; neutral tone
- New up-front sections: "Origin & original requirements (from the master)"
  (attribution + the 7 requirements as defined upstream) and "How this fork has
  deviated (and why)" (a fact table: Area / Master / This fork / Reason, tied to
  D-001..D-005).
- Rewrote executive summary and scrubbed value-judgement language throughout
  (removed "more useful to the org", "why it is powerful", "scoreboard", etc.).
  Now fact- and feature-based; original vision attributed to the master.

Co-Authored-By: Claude Opus 4.8 <noreply@anthropic.com>
</commit_message>
<xml_diff>
--- a/Permafleet-Solution-Brief.docx
+++ b/Permafleet-Solution-Brief.docx
@@ -72,6 +72,32 @@
         <w:spacing w:after="60"/>
       </w:pPr>
       <w:r>
+        <w:t xml:space="preserve">Origin &amp; original requirements (from the master)</w:t>
+      </w:r>
+    </w:p>
+    <w:p>
+      <w:pPr>
+        <w:pStyle w:val="ListParagraph"/>
+        <w:numPr>
+          <w:ilvl w:val="0"/>
+          <w:numId w:val="2"/>
+        </w:numPr>
+        <w:spacing w:after="60"/>
+      </w:pPr>
+      <w:r>
+        <w:t xml:space="preserve">How this fork has deviated (and why)</w:t>
+      </w:r>
+    </w:p>
+    <w:p>
+      <w:pPr>
+        <w:pStyle w:val="ListParagraph"/>
+        <w:numPr>
+          <w:ilvl w:val="0"/>
+          <w:numId w:val="2"/>
+        </w:numPr>
+        <w:spacing w:after="60"/>
+      </w:pPr>
+      <w:r>
         <w:t xml:space="preserve">Executive summary</w:t>
       </w:r>
     </w:p>
@@ -254,6 +280,972 @@
         <w:pStyle w:val="Heading1"/>
       </w:pPr>
       <w:r>
+        <w:t xml:space="preserve">Origin &amp; original requirements (from the master)</w:t>
+      </w:r>
+    </w:p>
+    <w:p>
+      <w:pPr>
+        <w:spacing w:after="120" w:line="276"/>
+      </w:pPr>
+      <w:r>
+        <w:t xml:space="preserve">This project originates from the master repository established under the org’s direction (upstream: GoonCitizen/star-citizen-live; fork basis: martindale/star-citizen-live, branch feature/fabric-0.1.0; package @rsi/star-citizen; MIT licence). The work in this fork (Neorion/star-citizen-live, branch feature/fabric-free-m1) continues that project. This section records the requirements as defined in the master so that the subsequent changes can be read against them.</w:t>
+      </w:r>
+    </w:p>
+    <w:p>
+      <w:pPr>
+        <w:spacing w:after="120" w:line="276"/>
+      </w:pPr>
+      <w:r>
+        <w:rPr>
+          <w:b/>
+          <w:bCs/>
+        </w:rPr>
+        <w:t xml:space="preserve">Requirements as defined in the master:</w:t>
+      </w:r>
+    </w:p>
+    <w:p>
+      <w:pPr>
+        <w:pStyle w:val="ListParagraph"/>
+        <w:numPr>
+          <w:ilvl w:val="0"/>
+          <w:numId w:val="3"/>
+        </w:numPr>
+        <w:spacing w:after="60"/>
+      </w:pPr>
+      <w:r>
+        <w:t xml:space="preserve">Watch the Star Citizen Game.log live, read-only.</w:t>
+      </w:r>
+    </w:p>
+    <w:p>
+      <w:pPr>
+        <w:pStyle w:val="ListParagraph"/>
+        <w:numPr>
+          <w:ilvl w:val="0"/>
+          <w:numId w:val="3"/>
+        </w:numPr>
+        <w:spacing w:after="60"/>
+      </w:pPr>
+      <w:r>
+        <w:t xml:space="preserve">Relay events to a Discord channel as rich embeds (activities, kills, player joins, missions, applications).</w:t>
+      </w:r>
+    </w:p>
+    <w:p>
+      <w:pPr>
+        <w:pStyle w:val="ListParagraph"/>
+        <w:numPr>
+          <w:ilvl w:val="0"/>
+          <w:numId w:val="3"/>
+        </w:numPr>
+        <w:spacing w:after="60"/>
+      </w:pPr>
+      <w:r>
+        <w:t xml:space="preserve">Expose a REST API (port 3041) with collections: activities, players, vehicles, kills, messages/logs, missions, applications, status.</w:t>
+      </w:r>
+    </w:p>
+    <w:p>
+      <w:pPr>
+        <w:pStyle w:val="ListParagraph"/>
+        <w:numPr>
+          <w:ilvl w:val="0"/>
+          <w:numId w:val="3"/>
+        </w:numPr>
+        <w:spacing w:after="60"/>
+      </w:pPr>
+      <w:r>
+        <w:t xml:space="preserve">Detect specific in-game events from the log (e.g. kills, player joins, vehicle destruction).</w:t>
+      </w:r>
+    </w:p>
+    <w:p>
+      <w:pPr>
+        <w:pStyle w:val="ListParagraph"/>
+        <w:numPr>
+          <w:ilvl w:val="0"/>
+          <w:numId w:val="3"/>
+        </w:numPr>
+        <w:spacing w:after="60"/>
+      </w:pPr>
+      <w:r>
+        <w:t xml:space="preserve">Provide a missions/contracts system: members post missions (bounty / cargo / exploration) with UEC rewards; others apply; contracts cryptographically signed — single-signer or multisig (secp256k1 / musig2).</w:t>
+      </w:r>
+    </w:p>
+    <w:p>
+      <w:pPr>
+        <w:pStyle w:val="ListParagraph"/>
+        <w:numPr>
+          <w:ilvl w:val="0"/>
+          <w:numId w:val="3"/>
+        </w:numPr>
+        <w:spacing w:after="60"/>
+      </w:pPr>
+      <w:r>
+        <w:t xml:space="preserve">Run on the Fabric framework as a decentralized peer-to-peer service (signed, content-addressed objects), extending a Fabric Hub.</w:t>
+      </w:r>
+    </w:p>
+    <w:p>
+      <w:pPr>
+        <w:pStyle w:val="ListParagraph"/>
+        <w:numPr>
+          <w:ilvl w:val="0"/>
+          <w:numId w:val="3"/>
+        </w:numPr>
+        <w:spacing w:after="60"/>
+      </w:pPr>
+      <w:r>
+        <w:t xml:space="preserve">Provide a web user interface (React / server-rendered Semantic UI).</w:t>
+      </w:r>
+    </w:p>
+    <w:p>
+      <w:pPr>
+        <w:pStyle w:val="Heading1"/>
+      </w:pPr>
+      <w:r>
+        <w:t xml:space="preserve">How this fork has deviated (and why)</w:t>
+      </w:r>
+    </w:p>
+    <w:p>
+      <w:pPr>
+        <w:spacing w:after="120" w:line="276"/>
+      </w:pPr>
+      <w:r>
+        <w:t xml:space="preserve">The fork pursues the same goals. The changes below were made for the technical reasons stated; each is recorded in </w:t>
+      </w:r>
+      <w:r>
+        <w:rPr>
+          <w:b/>
+          <w:bCs/>
+        </w:rPr>
+        <w:t xml:space="preserve">DECISIONS.md (D-001…D-005)</w:t>
+      </w:r>
+      <w:r>
+        <w:t xml:space="preserve"> and </w:t>
+      </w:r>
+      <w:r>
+        <w:rPr>
+          <w:b/>
+          <w:bCs/>
+        </w:rPr>
+        <w:t xml:space="preserve">PROGRESS.md</w:t>
+      </w:r>
+      <w:r>
+        <w:t xml:space="preserve">.</w:t>
+      </w:r>
+    </w:p>
+    <w:tbl>
+      <w:tblPr>
+        <w:tblW w:type="dxa" w:w="9360"/>
+        <w:tblBorders>
+          <w:top w:val="single" w:color="CCCCCC" w:sz="1"/>
+          <w:left w:val="single" w:color="CCCCCC" w:sz="1"/>
+          <w:bottom w:val="single" w:color="CCCCCC" w:sz="1"/>
+          <w:right w:val="single" w:color="CCCCCC" w:sz="1"/>
+          <w:insideH w:val="single" w:color="CCCCCC" w:sz="1"/>
+          <w:insideV w:val="single" w:color="CCCCCC" w:sz="1"/>
+        </w:tblBorders>
+      </w:tblPr>
+      <w:tblGrid>
+        <w:gridCol w:w="1500"/>
+        <w:gridCol w:w="2500"/>
+        <w:gridCol w:w="2680"/>
+        <w:gridCol w:w="2680"/>
+      </w:tblGrid>
+      <w:tr>
+        <w:trPr>
+          <w:tblHeader/>
+        </w:trPr>
+        <w:tc>
+          <w:tcPr>
+            <w:tcW w:type="dxa" w:w="1500"/>
+            <w:shd w:fill="2f6db0" w:val="clear"/>
+            <w:tcMar>
+              <w:top w:type="dxa" w:w="60"/>
+              <w:left w:type="dxa" w:w="110"/>
+              <w:bottom w:type="dxa" w:w="60"/>
+              <w:right w:type="dxa" w:w="110"/>
+            </w:tcMar>
+          </w:tcPr>
+          <w:p>
+            <w:r>
+              <w:rPr>
+                <w:b/>
+                <w:bCs/>
+                <w:color w:val="FFFFFF"/>
+                <w:sz w:val="19"/>
+                <w:szCs w:val="19"/>
+              </w:rPr>
+              <w:t xml:space="preserve">Area</w:t>
+            </w:r>
+          </w:p>
+        </w:tc>
+        <w:tc>
+          <w:tcPr>
+            <w:tcW w:type="dxa" w:w="2500"/>
+            <w:shd w:fill="2f6db0" w:val="clear"/>
+            <w:tcMar>
+              <w:top w:type="dxa" w:w="60"/>
+              <w:left w:type="dxa" w:w="110"/>
+              <w:bottom w:type="dxa" w:w="60"/>
+              <w:right w:type="dxa" w:w="110"/>
+            </w:tcMar>
+          </w:tcPr>
+          <w:p>
+            <w:r>
+              <w:rPr>
+                <w:b/>
+                <w:bCs/>
+                <w:color w:val="FFFFFF"/>
+                <w:sz w:val="19"/>
+                <w:szCs w:val="19"/>
+              </w:rPr>
+              <w:t xml:space="preserve">Master (original)</w:t>
+            </w:r>
+          </w:p>
+        </w:tc>
+        <w:tc>
+          <w:tcPr>
+            <w:tcW w:type="dxa" w:w="2680"/>
+            <w:shd w:fill="2f6db0" w:val="clear"/>
+            <w:tcMar>
+              <w:top w:type="dxa" w:w="60"/>
+              <w:left w:type="dxa" w:w="110"/>
+              <w:bottom w:type="dxa" w:w="60"/>
+              <w:right w:type="dxa" w:w="110"/>
+            </w:tcMar>
+          </w:tcPr>
+          <w:p>
+            <w:r>
+              <w:rPr>
+                <w:b/>
+                <w:bCs/>
+                <w:color w:val="FFFFFF"/>
+                <w:sz w:val="19"/>
+                <w:szCs w:val="19"/>
+              </w:rPr>
+              <w:t xml:space="preserve">This fork</w:t>
+            </w:r>
+          </w:p>
+        </w:tc>
+        <w:tc>
+          <w:tcPr>
+            <w:tcW w:type="dxa" w:w="2680"/>
+            <w:shd w:fill="2f6db0" w:val="clear"/>
+            <w:tcMar>
+              <w:top w:type="dxa" w:w="60"/>
+              <w:left w:type="dxa" w:w="110"/>
+              <w:bottom w:type="dxa" w:w="60"/>
+              <w:right w:type="dxa" w:w="110"/>
+            </w:tcMar>
+          </w:tcPr>
+          <w:p>
+            <w:r>
+              <w:rPr>
+                <w:b/>
+                <w:bCs/>
+                <w:color w:val="FFFFFF"/>
+                <w:sz w:val="19"/>
+                <w:szCs w:val="19"/>
+              </w:rPr>
+              <w:t xml:space="preserve">Reason</w:t>
+            </w:r>
+          </w:p>
+        </w:tc>
+      </w:tr>
+      <w:tr>
+        <w:tc>
+          <w:tcPr>
+            <w:tcW w:type="dxa" w:w="1500"/>
+            <w:shd w:fill="FFFFFF" w:val="clear"/>
+            <w:tcMar>
+              <w:top w:type="dxa" w:w="60"/>
+              <w:left w:type="dxa" w:w="110"/>
+              <w:bottom w:type="dxa" w:w="60"/>
+              <w:right w:type="dxa" w:w="110"/>
+            </w:tcMar>
+          </w:tcPr>
+          <w:p>
+            <w:r>
+              <w:rPr>
+                <w:b w:val="false"/>
+                <w:bCs w:val="false"/>
+                <w:color w:val="1a2230"/>
+                <w:sz w:val="19"/>
+                <w:szCs w:val="19"/>
+              </w:rPr>
+              <w:t xml:space="preserve">Framework</w:t>
+            </w:r>
+          </w:p>
+        </w:tc>
+        <w:tc>
+          <w:tcPr>
+            <w:tcW w:type="dxa" w:w="2500"/>
+            <w:shd w:fill="FFFFFF" w:val="clear"/>
+            <w:tcMar>
+              <w:top w:type="dxa" w:w="60"/>
+              <w:left w:type="dxa" w:w="110"/>
+              <w:bottom w:type="dxa" w:w="60"/>
+              <w:right w:type="dxa" w:w="110"/>
+            </w:tcMar>
+          </w:tcPr>
+          <w:p>
+            <w:r>
+              <w:rPr>
+                <w:b w:val="false"/>
+                <w:bCs w:val="false"/>
+                <w:color w:val="1a2230"/>
+                <w:sz w:val="19"/>
+                <w:szCs w:val="19"/>
+              </w:rPr>
+              <w:t xml:space="preserve">Fabric (p2p), extends Hub</w:t>
+            </w:r>
+          </w:p>
+        </w:tc>
+        <w:tc>
+          <w:tcPr>
+            <w:tcW w:type="dxa" w:w="2680"/>
+            <w:shd w:fill="FFFFFF" w:val="clear"/>
+            <w:tcMar>
+              <w:top w:type="dxa" w:w="60"/>
+              <w:left w:type="dxa" w:w="110"/>
+              <w:bottom w:type="dxa" w:w="60"/>
+              <w:right w:type="dxa" w:w="110"/>
+            </w:tcMar>
+          </w:tcPr>
+          <w:p>
+            <w:r>
+              <w:rPr>
+                <w:b w:val="false"/>
+                <w:bCs w:val="false"/>
+                <w:color w:val="1a2230"/>
+                <w:sz w:val="19"/>
+                <w:szCs w:val="19"/>
+              </w:rPr>
+              <w:t xml:space="preserve">Standard Node.js built-ins (http, events, crypto)</w:t>
+            </w:r>
+          </w:p>
+        </w:tc>
+        <w:tc>
+          <w:tcPr>
+            <w:tcW w:type="dxa" w:w="2680"/>
+            <w:shd w:fill="FFFFFF" w:val="clear"/>
+            <w:tcMar>
+              <w:top w:type="dxa" w:w="60"/>
+              <w:left w:type="dxa" w:w="110"/>
+              <w:bottom w:type="dxa" w:w="60"/>
+              <w:right w:type="dxa" w:w="110"/>
+            </w:tcMar>
+          </w:tcPr>
+          <w:p>
+            <w:r>
+              <w:rPr>
+                <w:b w:val="false"/>
+                <w:bCs w:val="false"/>
+                <w:color w:val="1a2230"/>
+                <w:sz w:val="19"/>
+                <w:szCs w:val="19"/>
+              </w:rPr>
+              <w:t xml:space="preserve">Fabric ~400 MB incl. a headless browser; deps installed over SSH GitHub URLs that failed on clean machines; a core package absent from the dependency list; install never completed in a clean environment (D-002).</w:t>
+            </w:r>
+          </w:p>
+        </w:tc>
+      </w:tr>
+      <w:tr>
+        <w:tc>
+          <w:tcPr>
+            <w:tcW w:type="dxa" w:w="1500"/>
+            <w:shd w:fill="FFFFFF" w:val="clear"/>
+            <w:tcMar>
+              <w:top w:type="dxa" w:w="60"/>
+              <w:left w:type="dxa" w:w="110"/>
+              <w:bottom w:type="dxa" w:w="60"/>
+              <w:right w:type="dxa" w:w="110"/>
+            </w:tcMar>
+          </w:tcPr>
+          <w:p>
+            <w:r>
+              <w:rPr>
+                <w:b w:val="false"/>
+                <w:bCs w:val="false"/>
+                <w:color w:val="1a2230"/>
+                <w:sz w:val="19"/>
+                <w:szCs w:val="19"/>
+              </w:rPr>
+              <w:t xml:space="preserve">Hosting / trust</w:t>
+            </w:r>
+          </w:p>
+        </w:tc>
+        <w:tc>
+          <w:tcPr>
+            <w:tcW w:type="dxa" w:w="2500"/>
+            <w:shd w:fill="FFFFFF" w:val="clear"/>
+            <w:tcMar>
+              <w:top w:type="dxa" w:w="60"/>
+              <w:left w:type="dxa" w:w="110"/>
+              <w:bottom w:type="dxa" w:w="60"/>
+              <w:right w:type="dxa" w:w="110"/>
+            </w:tcMar>
+          </w:tcPr>
+          <w:p>
+            <w:r>
+              <w:rPr>
+                <w:b w:val="false"/>
+                <w:bCs w:val="false"/>
+                <w:color w:val="1a2230"/>
+                <w:sz w:val="19"/>
+                <w:szCs w:val="19"/>
+              </w:rPr>
+              <w:t xml:space="preserve">Trustless p2p network</w:t>
+            </w:r>
+          </w:p>
+        </w:tc>
+        <w:tc>
+          <w:tcPr>
+            <w:tcW w:type="dxa" w:w="2680"/>
+            <w:shd w:fill="FFFFFF" w:val="clear"/>
+            <w:tcMar>
+              <w:top w:type="dxa" w:w="60"/>
+              <w:left w:type="dxa" w:w="110"/>
+              <w:bottom w:type="dxa" w:w="60"/>
+              <w:right w:type="dxa" w:w="110"/>
+            </w:tcMar>
+          </w:tcPr>
+          <w:p>
+            <w:r>
+              <w:rPr>
+                <w:b w:val="false"/>
+                <w:bCs w:val="false"/>
+                <w:color w:val="1a2230"/>
+                <w:sz w:val="19"/>
+                <w:szCs w:val="19"/>
+              </w:rPr>
+              <w:t xml:space="preserve">One central service on a VPS; Discord for identity</w:t>
+            </w:r>
+          </w:p>
+        </w:tc>
+        <w:tc>
+          <w:tcPr>
+            <w:tcW w:type="dxa" w:w="2680"/>
+            <w:shd w:fill="FFFFFF" w:val="clear"/>
+            <w:tcMar>
+              <w:top w:type="dxa" w:w="60"/>
+              <w:left w:type="dxa" w:w="110"/>
+              <w:bottom w:type="dxa" w:w="60"/>
+              <w:right w:type="dxa" w:w="110"/>
+            </w:tcMar>
+          </w:tcPr>
+          <w:p>
+            <w:r>
+              <w:rPr>
+                <w:b w:val="false"/>
+                <w:bCs w:val="false"/>
+                <w:color w:val="1a2230"/>
+                <w:sz w:val="19"/>
+                <w:szCs w:val="19"/>
+              </w:rPr>
+              <w:t xml:space="preserve">The required functions (watch log, post to Discord, share contracts) do not require p2p; the org has a defined authority (D-003).</w:t>
+            </w:r>
+          </w:p>
+        </w:tc>
+      </w:tr>
+      <w:tr>
+        <w:tc>
+          <w:tcPr>
+            <w:tcW w:type="dxa" w:w="1500"/>
+            <w:shd w:fill="FFFFFF" w:val="clear"/>
+            <w:tcMar>
+              <w:top w:type="dxa" w:w="60"/>
+              <w:left w:type="dxa" w:w="110"/>
+              <w:bottom w:type="dxa" w:w="60"/>
+              <w:right w:type="dxa" w:w="110"/>
+            </w:tcMar>
+          </w:tcPr>
+          <w:p>
+            <w:r>
+              <w:rPr>
+                <w:b w:val="false"/>
+                <w:bCs w:val="false"/>
+                <w:color w:val="1a2230"/>
+                <w:sz w:val="19"/>
+                <w:szCs w:val="19"/>
+              </w:rPr>
+              <w:t xml:space="preserve">Mission contracts</w:t>
+            </w:r>
+          </w:p>
+        </w:tc>
+        <w:tc>
+          <w:tcPr>
+            <w:tcW w:type="dxa" w:w="2500"/>
+            <w:shd w:fill="FFFFFF" w:val="clear"/>
+            <w:tcMar>
+              <w:top w:type="dxa" w:w="60"/>
+              <w:left w:type="dxa" w:w="110"/>
+              <w:bottom w:type="dxa" w:w="60"/>
+              <w:right w:type="dxa" w:w="110"/>
+            </w:tcMar>
+          </w:tcPr>
+          <w:p>
+            <w:r>
+              <w:rPr>
+                <w:b w:val="false"/>
+                <w:bCs w:val="false"/>
+                <w:color w:val="1a2230"/>
+                <w:sz w:val="19"/>
+                <w:szCs w:val="19"/>
+              </w:rPr>
+              <w:t xml:space="preserve">Crypto single/multisig contracts</w:t>
+            </w:r>
+          </w:p>
+        </w:tc>
+        <w:tc>
+          <w:tcPr>
+            <w:tcW w:type="dxa" w:w="2680"/>
+            <w:shd w:fill="FFFFFF" w:val="clear"/>
+            <w:tcMar>
+              <w:top w:type="dxa" w:w="60"/>
+              <w:left w:type="dxa" w:w="110"/>
+              <w:bottom w:type="dxa" w:w="60"/>
+              <w:right w:type="dxa" w:w="110"/>
+            </w:tcMar>
+          </w:tcPr>
+          <w:p>
+            <w:r>
+              <w:rPr>
+                <w:b w:val="false"/>
+                <w:bCs w:val="false"/>
+                <w:color w:val="1a2230"/>
+                <w:sz w:val="19"/>
+                <w:szCs w:val="19"/>
+              </w:rPr>
+              <w:t xml:space="preserve">Central register with officer validation; crypto/multisig deferred (seam + types/Mission.js retained)</w:t>
+            </w:r>
+          </w:p>
+        </w:tc>
+        <w:tc>
+          <w:tcPr>
+            <w:tcW w:type="dxa" w:w="2680"/>
+            <w:shd w:fill="FFFFFF" w:val="clear"/>
+            <w:tcMar>
+              <w:top w:type="dxa" w:w="60"/>
+              <w:left w:type="dxa" w:w="110"/>
+              <w:bottom w:type="dxa" w:w="60"/>
+              <w:right w:type="dxa" w:w="110"/>
+            </w:tcMar>
+          </w:tcPr>
+          <w:p>
+            <w:r>
+              <w:rPr>
+                <w:b w:val="false"/>
+                <w:bCs w:val="false"/>
+                <w:color w:val="1a2230"/>
+                <w:sz w:val="19"/>
+                <w:szCs w:val="19"/>
+              </w:rPr>
+              <w:t xml:space="preserve">A player’s log is self-reported and cannot prove completion; an officer validates (D-005).</w:t>
+            </w:r>
+          </w:p>
+        </w:tc>
+      </w:tr>
+      <w:tr>
+        <w:tc>
+          <w:tcPr>
+            <w:tcW w:type="dxa" w:w="1500"/>
+            <w:shd w:fill="FFFFFF" w:val="clear"/>
+            <w:tcMar>
+              <w:top w:type="dxa" w:w="60"/>
+              <w:left w:type="dxa" w:w="110"/>
+              <w:bottom w:type="dxa" w:w="60"/>
+              <w:right w:type="dxa" w:w="110"/>
+            </w:tcMar>
+          </w:tcPr>
+          <w:p>
+            <w:r>
+              <w:rPr>
+                <w:b w:val="false"/>
+                <w:bCs w:val="false"/>
+                <w:color w:val="1a2230"/>
+                <w:sz w:val="19"/>
+                <w:szCs w:val="19"/>
+              </w:rPr>
+              <w:t xml:space="preserve">Kill detection</w:t>
+            </w:r>
+          </w:p>
+        </w:tc>
+        <w:tc>
+          <w:tcPr>
+            <w:tcW w:type="dxa" w:w="2500"/>
+            <w:shd w:fill="FFFFFF" w:val="clear"/>
+            <w:tcMar>
+              <w:top w:type="dxa" w:w="60"/>
+              <w:left w:type="dxa" w:w="110"/>
+              <w:bottom w:type="dxa" w:w="60"/>
+              <w:right w:type="dxa" w:w="110"/>
+            </w:tcMar>
+          </w:tcPr>
+          <w:p>
+            <w:r>
+              <w:rPr>
+                <w:b w:val="false"/>
+                <w:bCs w:val="false"/>
+                <w:color w:val="1a2230"/>
+                <w:sz w:val="19"/>
+                <w:szCs w:val="19"/>
+              </w:rPr>
+              <w:t xml:space="preserve">“Kills announced to Discord”</w:t>
+            </w:r>
+          </w:p>
+        </w:tc>
+        <w:tc>
+          <w:tcPr>
+            <w:tcW w:type="dxa" w:w="2680"/>
+            <w:shd w:fill="FFFFFF" w:val="clear"/>
+            <w:tcMar>
+              <w:top w:type="dxa" w:w="60"/>
+              <w:left w:type="dxa" w:w="110"/>
+              <w:bottom w:type="dxa" w:w="60"/>
+              <w:right w:type="dxa" w:w="110"/>
+            </w:tcMar>
+          </w:tcPr>
+          <w:p>
+            <w:r>
+              <w:rPr>
+                <w:b w:val="false"/>
+                <w:bCs w:val="false"/>
+                <w:color w:val="1a2230"/>
+                <w:sz w:val="19"/>
+                <w:szCs w:val="19"/>
+              </w:rPr>
+              <w:t xml:space="preserve">Mission/objective tracking + combat-objective proxy</w:t>
+            </w:r>
+          </w:p>
+        </w:tc>
+        <w:tc>
+          <w:tcPr>
+            <w:tcW w:type="dxa" w:w="2680"/>
+            <w:shd w:fill="FFFFFF" w:val="clear"/>
+            <w:tcMar>
+              <w:top w:type="dxa" w:w="60"/>
+              <w:left w:type="dxa" w:w="110"/>
+              <w:bottom w:type="dxa" w:w="60"/>
+              <w:right w:type="dxa" w:w="110"/>
+            </w:tcMar>
+          </w:tcPr>
+          <w:p>
+            <w:r>
+              <w:rPr>
+                <w:b w:val="false"/>
+                <w:bCs w:val="false"/>
+                <w:color w:val="1a2230"/>
+                <w:sz w:val="19"/>
+                <w:szCs w:val="19"/>
+              </w:rPr>
+              <w:t xml:space="preserve">SC 4.8.0 client log records no kills or ship destruction (verified against real logs) (M3, M3.5).</w:t>
+            </w:r>
+          </w:p>
+        </w:tc>
+      </w:tr>
+      <w:tr>
+        <w:tc>
+          <w:tcPr>
+            <w:tcW w:type="dxa" w:w="1500"/>
+            <w:shd w:fill="FFFFFF" w:val="clear"/>
+            <w:tcMar>
+              <w:top w:type="dxa" w:w="60"/>
+              <w:left w:type="dxa" w:w="110"/>
+              <w:bottom w:type="dxa" w:w="60"/>
+              <w:right w:type="dxa" w:w="110"/>
+            </w:tcMar>
+          </w:tcPr>
+          <w:p>
+            <w:r>
+              <w:rPr>
+                <w:b w:val="false"/>
+                <w:bCs w:val="false"/>
+                <w:color w:val="1a2230"/>
+                <w:sz w:val="19"/>
+                <w:szCs w:val="19"/>
+              </w:rPr>
+              <w:t xml:space="preserve">Install footprint</w:t>
+            </w:r>
+          </w:p>
+        </w:tc>
+        <w:tc>
+          <w:tcPr>
+            <w:tcW w:type="dxa" w:w="2500"/>
+            <w:shd w:fill="FFFFFF" w:val="clear"/>
+            <w:tcMar>
+              <w:top w:type="dxa" w:w="60"/>
+              <w:left w:type="dxa" w:w="110"/>
+              <w:bottom w:type="dxa" w:w="60"/>
+              <w:right w:type="dxa" w:w="110"/>
+            </w:tcMar>
+          </w:tcPr>
+          <w:p>
+            <w:r>
+              <w:rPr>
+                <w:b w:val="false"/>
+                <w:bCs w:val="false"/>
+                <w:color w:val="1a2230"/>
+                <w:sz w:val="19"/>
+                <w:szCs w:val="19"/>
+              </w:rPr>
+              <w:t xml:space="preserve">~400 MB Fabric dependency tree</w:t>
+            </w:r>
+          </w:p>
+        </w:tc>
+        <w:tc>
+          <w:tcPr>
+            <w:tcW w:type="dxa" w:w="2680"/>
+            <w:shd w:fill="FFFFFF" w:val="clear"/>
+            <w:tcMar>
+              <w:top w:type="dxa" w:w="60"/>
+              <w:left w:type="dxa" w:w="110"/>
+              <w:bottom w:type="dxa" w:w="60"/>
+              <w:right w:type="dxa" w:w="110"/>
+            </w:tcMar>
+          </w:tcPr>
+          <w:p>
+            <w:r>
+              <w:rPr>
+                <w:b w:val="false"/>
+                <w:bCs w:val="false"/>
+                <w:color w:val="1a2230"/>
+                <w:sz w:val="19"/>
+                <w:szCs w:val="19"/>
+              </w:rPr>
+              <w:t xml:space="preserve">Zero runtime dependencies</w:t>
+            </w:r>
+          </w:p>
+        </w:tc>
+        <w:tc>
+          <w:tcPr>
+            <w:tcW w:type="dxa" w:w="2680"/>
+            <w:shd w:fill="FFFFFF" w:val="clear"/>
+            <w:tcMar>
+              <w:top w:type="dxa" w:w="60"/>
+              <w:left w:type="dxa" w:w="110"/>
+              <w:bottom w:type="dxa" w:w="60"/>
+              <w:right w:type="dxa" w:w="110"/>
+            </w:tcMar>
+          </w:tcPr>
+          <w:p>
+            <w:r>
+              <w:rPr>
+                <w:b w:val="false"/>
+                <w:bCs w:val="false"/>
+                <w:color w:val="1a2230"/>
+                <w:sz w:val="19"/>
+                <w:szCs w:val="19"/>
+              </w:rPr>
+              <w:t xml:space="preserve">Removing Fabric eliminated the dependency tree (M2, M3.7).</w:t>
+            </w:r>
+          </w:p>
+        </w:tc>
+      </w:tr>
+      <w:tr>
+        <w:tc>
+          <w:tcPr>
+            <w:tcW w:type="dxa" w:w="1500"/>
+            <w:shd w:fill="FFFFFF" w:val="clear"/>
+            <w:tcMar>
+              <w:top w:type="dxa" w:w="60"/>
+              <w:left w:type="dxa" w:w="110"/>
+              <w:bottom w:type="dxa" w:w="60"/>
+              <w:right w:type="dxa" w:w="110"/>
+            </w:tcMar>
+          </w:tcPr>
+          <w:p>
+            <w:r>
+              <w:rPr>
+                <w:b w:val="false"/>
+                <w:bCs w:val="false"/>
+                <w:color w:val="1a2230"/>
+                <w:sz w:val="19"/>
+                <w:szCs w:val="19"/>
+              </w:rPr>
+              <w:t xml:space="preserve">Web UI</w:t>
+            </w:r>
+          </w:p>
+        </w:tc>
+        <w:tc>
+          <w:tcPr>
+            <w:tcW w:type="dxa" w:w="2500"/>
+            <w:shd w:fill="FFFFFF" w:val="clear"/>
+            <w:tcMar>
+              <w:top w:type="dxa" w:w="60"/>
+              <w:left w:type="dxa" w:w="110"/>
+              <w:bottom w:type="dxa" w:w="60"/>
+              <w:right w:type="dxa" w:w="110"/>
+            </w:tcMar>
+          </w:tcPr>
+          <w:p>
+            <w:r>
+              <w:rPr>
+                <w:b w:val="false"/>
+                <w:bCs w:val="false"/>
+                <w:color w:val="1a2230"/>
+                <w:sz w:val="19"/>
+                <w:szCs w:val="19"/>
+              </w:rPr>
+              <w:t xml:space="preserve">React / Semantic UI shell</w:t>
+            </w:r>
+          </w:p>
+        </w:tc>
+        <w:tc>
+          <w:tcPr>
+            <w:tcW w:type="dxa" w:w="2680"/>
+            <w:shd w:fill="FFFFFF" w:val="clear"/>
+            <w:tcMar>
+              <w:top w:type="dxa" w:w="60"/>
+              <w:left w:type="dxa" w:w="110"/>
+              <w:bottom w:type="dxa" w:w="60"/>
+              <w:right w:type="dxa" w:w="110"/>
+            </w:tcMar>
+          </w:tcPr>
+          <w:p>
+            <w:r>
+              <w:rPr>
+                <w:b w:val="false"/>
+                <w:bCs w:val="false"/>
+                <w:color w:val="1a2230"/>
+                <w:sz w:val="19"/>
+                <w:szCs w:val="19"/>
+              </w:rPr>
+              <w:t xml:space="preserve">Built-in HTML dashboard; Discord-role-gated web UI planned</w:t>
+            </w:r>
+          </w:p>
+        </w:tc>
+        <w:tc>
+          <w:tcPr>
+            <w:tcW w:type="dxa" w:w="2680"/>
+            <w:shd w:fill="FFFFFF" w:val="clear"/>
+            <w:tcMar>
+              <w:top w:type="dxa" w:w="60"/>
+              <w:left w:type="dxa" w:w="110"/>
+              <w:bottom w:type="dxa" w:w="60"/>
+              <w:right w:type="dxa" w:w="110"/>
+            </w:tcMar>
+          </w:tcPr>
+          <w:p>
+            <w:r>
+              <w:rPr>
+                <w:b w:val="false"/>
+                <w:bCs w:val="false"/>
+                <w:color w:val="1a2230"/>
+                <w:sz w:val="19"/>
+                <w:szCs w:val="19"/>
+              </w:rPr>
+              <w:t xml:space="preserve">Rebuilt without the Fabric/React stack.</w:t>
+            </w:r>
+          </w:p>
+        </w:tc>
+      </w:tr>
+      <w:tr>
+        <w:tc>
+          <w:tcPr>
+            <w:tcW w:type="dxa" w:w="1500"/>
+            <w:shd w:fill="FFFFFF" w:val="clear"/>
+            <w:tcMar>
+              <w:top w:type="dxa" w:w="60"/>
+              <w:left w:type="dxa" w:w="110"/>
+              <w:bottom w:type="dxa" w:w="60"/>
+              <w:right w:type="dxa" w:w="110"/>
+            </w:tcMar>
+          </w:tcPr>
+          <w:p>
+            <w:r>
+              <w:rPr>
+                <w:b w:val="false"/>
+                <w:bCs w:val="false"/>
+                <w:color w:val="1a2230"/>
+                <w:sz w:val="19"/>
+                <w:szCs w:val="19"/>
+              </w:rPr>
+              <w:t xml:space="preserve">Decentralization</w:t>
+            </w:r>
+          </w:p>
+        </w:tc>
+        <w:tc>
+          <w:tcPr>
+            <w:tcW w:type="dxa" w:w="2500"/>
+            <w:shd w:fill="FFFFFF" w:val="clear"/>
+            <w:tcMar>
+              <w:top w:type="dxa" w:w="60"/>
+              <w:left w:type="dxa" w:w="110"/>
+              <w:bottom w:type="dxa" w:w="60"/>
+              <w:right w:type="dxa" w:w="110"/>
+            </w:tcMar>
+          </w:tcPr>
+          <w:p>
+            <w:r>
+              <w:rPr>
+                <w:b w:val="false"/>
+                <w:bCs w:val="false"/>
+                <w:color w:val="1a2230"/>
+                <w:sz w:val="19"/>
+                <w:szCs w:val="19"/>
+              </w:rPr>
+              <w:t xml:space="preserve">Core requirement (Fabric)</w:t>
+            </w:r>
+          </w:p>
+        </w:tc>
+        <w:tc>
+          <w:tcPr>
+            <w:tcW w:type="dxa" w:w="2680"/>
+            <w:shd w:fill="FFFFFF" w:val="clear"/>
+            <w:tcMar>
+              <w:top w:type="dxa" w:w="60"/>
+              <w:left w:type="dxa" w:w="110"/>
+              <w:bottom w:type="dxa" w:w="60"/>
+              <w:right w:type="dxa" w:w="110"/>
+            </w:tcMar>
+          </w:tcPr>
+          <w:p>
+            <w:r>
+              <w:rPr>
+                <w:b w:val="false"/>
+                <w:bCs w:val="false"/>
+                <w:color w:val="1a2230"/>
+                <w:sz w:val="19"/>
+                <w:szCs w:val="19"/>
+              </w:rPr>
+              <w:t xml:space="preserve">Optional future federation via signed gossip (not the Fabric framework)</w:t>
+            </w:r>
+          </w:p>
+        </w:tc>
+        <w:tc>
+          <w:tcPr>
+            <w:tcW w:type="dxa" w:w="2680"/>
+            <w:shd w:fill="FFFFFF" w:val="clear"/>
+            <w:tcMar>
+              <w:top w:type="dxa" w:w="60"/>
+              <w:left w:type="dxa" w:w="110"/>
+              <w:bottom w:type="dxa" w:w="60"/>
+              <w:right w:type="dxa" w:w="110"/>
+            </w:tcMar>
+          </w:tcPr>
+          <w:p>
+            <w:r>
+              <w:rPr>
+                <w:b w:val="false"/>
+                <w:bCs w:val="false"/>
+                <w:color w:val="1a2230"/>
+                <w:sz w:val="19"/>
+                <w:szCs w:val="19"/>
+              </w:rPr>
+              <w:t xml:space="preserve">Retained as an opt-in path, decoupled from the fragile transport (D-004).</w:t>
+            </w:r>
+          </w:p>
+        </w:tc>
+      </w:tr>
+    </w:tbl>
+    <w:p>
+      <w:r>
+        <w:br w:type="page"/>
+      </w:r>
+    </w:p>
+    <w:p>
+      <w:pPr>
+        <w:pStyle w:val="Heading1"/>
+      </w:pPr>
+      <w:r>
         <w:t xml:space="preserve">Executive summary</w:t>
       </w:r>
     </w:p>
@@ -262,7 +1254,7 @@
         <w:spacing w:after="120" w:line="276"/>
       </w:pPr>
       <w:r>
-        <w:t xml:space="preserve">This project began as a way to turn a single player’s Star Citizen game log into a Discord feed. Through hands-on testing it has grown into something more useful for an organisation: a </w:t>
+        <w:t xml:space="preserve">The system has two parts: a </w:t>
       </w:r>
       <w:r>
         <w:rPr>
@@ -272,7 +1264,7 @@
         <w:t xml:space="preserve">live activity relay</w:t>
       </w:r>
       <w:r>
-        <w:t xml:space="preserve"> that each member runs locally, feeding a </w:t>
+        <w:t xml:space="preserve"> that each member runs locally to read the Star Citizen game log, and a </w:t>
       </w:r>
       <w:r>
         <w:rPr>
@@ -282,7 +1274,7 @@
         <w:t xml:space="preserve">central mission register</w:t>
       </w:r>
       <w:r>
-        <w:t xml:space="preserve"> that officers use to post missions and fleet actions, members use to take part, and </w:t>
+        <w:t xml:space="preserve"> where officers post missions and fleet actions, members apply, and </w:t>
       </w:r>
       <w:r>
         <w:rPr>
@@ -292,35 +1284,32 @@
         <w:t xml:space="preserve">officers validate</w:t>
       </w:r>
       <w:r>
-        <w:t xml:space="preserve"> on completion — all backed by a tamper-evident record.</w:t>
-      </w:r>
-    </w:p>
-    <w:p>
-      <w:pPr>
-        <w:spacing w:after="120" w:line="276"/>
-      </w:pPr>
-      <w:r>
-        <w:t xml:space="preserve">The single most important thing we learned: </w:t>
+        <w:t xml:space="preserve"> on completion. All state changes are written to a tamper-evident audit log. </w:t>
       </w:r>
       <w:r>
         <w:rPr>
           <w:b/>
           <w:bCs/>
         </w:rPr>
-        <w:t xml:space="preserve">the game log cannot prove what happened.</w:t>
-      </w:r>
-      <w:r>
-        <w:t xml:space="preserve"> The current build does not record kills or ship destruction at all, and a player’s own log is self-reported. So the platform is deliberately built around </w:t>
+        <w:t xml:space="preserve">Discord is the primary interface.</w:t>
+      </w:r>
+    </w:p>
+    <w:p>
+      <w:pPr>
+        <w:spacing w:after="120" w:line="276"/>
+      </w:pPr>
+      <w:r>
+        <w:t xml:space="preserve">Testing established that the current game build (SC 4.8.0) does not record kills or ship destruction, and a player’s own log is self-reported. The register therefore uses </w:t>
       </w:r>
       <w:r>
         <w:rPr>
           <w:b/>
           <w:bCs/>
         </w:rPr>
-        <w:t xml:space="preserve">human (officer) validation</w:t>
-      </w:r>
-      <w:r>
-        <w:t xml:space="preserve"> as the authority, with the game log providing supporting “evidence” where it exists. This is exactly why it handles </w:t>
+        <w:t xml:space="preserve">officer validation</w:t>
+      </w:r>
+      <w:r>
+        <w:t xml:space="preserve"> as the authority for completion, with log activity attached as supporting evidence where it exists. The same model applies to </w:t>
       </w:r>
       <w:r>
         <w:rPr>
@@ -330,7 +1319,7 @@
         <w:t xml:space="preserve">out-of-game missions and fleet actions</w:t>
       </w:r>
       <w:r>
-        <w:t xml:space="preserve"> as naturally as in-game ones.</w:t>
+        <w:t xml:space="preserve">, which have no log signal.</w:t>
       </w:r>
     </w:p>
     <w:p>
@@ -338,7 +1327,7 @@
         <w:spacing w:after="120" w:line="276"/>
       </w:pPr>
       <w:r>
-        <w:t xml:space="preserve">Today the live relay and dashboard work and are tested; the mission register’s engine is built and proven end-to-end; the remaining work is to give it buttons (a web API and a Discord bot) and to host it on a small always-on server. A standout opportunity is to hook into </w:t>
+        <w:t xml:space="preserve">Current status: the live relay and dashboard are built and tested; the mission register engine is built and verified end-to-end. Remaining work: a web API and a Discord bot to operate the register, and hosting on an always-on server. A planned integration uses </w:t>
       </w:r>
       <w:r>
         <w:rPr>
@@ -348,7 +1337,7 @@
         <w:t xml:space="preserve">Discord Scheduled Events</w:t>
       </w:r>
       <w:r>
-        <w:t xml:space="preserve"> — officers already create them and members already click “Interested” — so we can capture interest, attendance and activity with almost no new workflow.</w:t>
+        <w:t xml:space="preserve"> to capture interest, attendance and in-window activity.</w:t>
       </w:r>
     </w:p>
     <w:p>
@@ -356,17 +1345,17 @@
         <w:spacing w:after="120" w:line="276"/>
       </w:pPr>
       <w:r>
-        <w:t xml:space="preserve">Looking further ahead, the architecture keeps the door open to a </w:t>
+        <w:t xml:space="preserve">A </w:t>
       </w:r>
       <w:r>
         <w:rPr>
           <w:b/>
           <w:bCs/>
         </w:rPr>
-        <w:t xml:space="preserve">decentralized (federated) deployment</w:t>
-      </w:r>
-      <w:r>
-        <w:t xml:space="preserve"> — where members’ own machines share signed updates so there is no single point of failure — without committing to it now. It is an optional resilience upgrade, not a requirement, and most of the value arrives well before it is needed.</w:t>
+        <w:t xml:space="preserve">federated deployment</w:t>
+      </w:r>
+      <w:r>
+        <w:t xml:space="preserve"> — members’ machines exchanging signed updates with no single point of failure — is retained as an optional future path (D-004), separate from the original Fabric framework. It is not required for the current scope.</w:t>
       </w:r>
     </w:p>
     <w:p>
@@ -1217,7 +2206,7 @@
         <w:spacing w:after="120" w:line="276"/>
       </w:pPr>
       <w:r>
-        <w:t xml:space="preserve">Every mission moves through a simple, auditable lifecycle. The </w:t>
+        <w:t xml:space="preserve">Every mission moves through an auditable lifecycle. The </w:t>
       </w:r>
       <w:r>
         <w:rPr>
@@ -1227,7 +2216,7 @@
         <w:t xml:space="preserve">officer validation</w:t>
       </w:r>
       <w:r>
-        <w:t xml:space="preserve"> step is the heart of it: because the log cannot prove completion, a human confirms it.</w:t>
+        <w:t xml:space="preserve"> step is the authority for completion: because the log cannot prove completion, an officer confirms it.</w:t>
       </w:r>
     </w:p>
     <w:p>
@@ -1385,14 +2374,7 @@
         <w:spacing w:after="120" w:line="276"/>
       </w:pPr>
       <w:r>
-        <w:rPr>
-          <w:b/>
-          <w:bCs/>
-        </w:rPr>
-        <w:t xml:space="preserve">Why it’s powerful: </w:t>
-      </w:r>
-      <w:r>
-        <w:t xml:space="preserve">it turns a workflow officers already use into a participation record — interested vs. turned-up vs. did-stuff — with almost no extra effort. The one prerequisite is a one-time link between each member’s relay and their Discord identity so activity can be attributed to the right person.</w:t>
+        <w:t xml:space="preserve">This produces a participation record per event — interested, turned-up and in-window activity — from a workflow already in use. The prerequisite is a one-time link between each member’s relay and their Discord identity so activity can be attributed to the correct person.</w:t>
       </w:r>
     </w:p>
     <w:p>
@@ -1408,7 +2390,7 @@
         <w:spacing w:after="120" w:line="276"/>
       </w:pPr>
       <w:r>
-        <w:t xml:space="preserve">At fleet scale a raw feed becomes noise. Three levers keep it valuable:</w:t>
+        <w:t xml:space="preserve">At fleet scale the feed is high-volume. Three controls reduce it:</w:t>
       </w:r>
     </w:p>
     <w:p>
@@ -1471,7 +2453,7 @@
         <w:spacing w:after="60"/>
       </w:pPr>
       <w:r>
-        <w:t xml:space="preserve">Edit a single message as it progresses, or use one thread per operation — the biggest noise-killer.</w:t>
+        <w:t xml:space="preserve">Edit a single message as it progresses, or use one thread per operation.</w:t>
       </w:r>
     </w:p>
     <w:p>
@@ -1500,14 +2482,7 @@
         <w:spacing w:after="120" w:line="276"/>
       </w:pPr>
       <w:r>
-        <w:rPr>
-          <w:b/>
-          <w:bCs/>
-        </w:rPr>
-        <w:t xml:space="preserve">The register is the scoreboard (trustworthy); the log is the colour commentary (engagement, clearly labelled “inferred”).</w:t>
-      </w:r>
-      <w:r>
-        <w:t xml:space="preserve"> Suggested measures:</w:t>
+        <w:t xml:space="preserve">Register data is validated by officers; log-derived data is inferred and labelled as such. Measures:</w:t>
       </w:r>
     </w:p>
     <w:tbl>
@@ -2136,17 +3111,17 @@
         <w:spacing w:after="120" w:line="276"/>
       </w:pPr>
       <w:r>
-        <w:t xml:space="preserve">Discord remains the primary interface, but a </w:t>
+        <w:t xml:space="preserve">Discord remains the primary interface. A </w:t>
       </w:r>
       <w:r>
         <w:rPr>
           <w:b/>
           <w:bCs/>
         </w:rPr>
-        <w:t xml:space="preserve">lightweight web front end on the VPS</w:t>
-      </w:r>
-      <w:r>
-        <w:t xml:space="preserve"> is a natural future addition for officers who want a richer view (a validation queue, metrics dashboards). The key idea: members </w:t>
+        <w:t xml:space="preserve">web front end on the VPS</w:t>
+      </w:r>
+      <w:r>
+        <w:t xml:space="preserve"> is a planned future addition (e.g. a validation queue and metrics dashboards). Members </w:t>
       </w:r>
       <w:r>
         <w:rPr>
@@ -2156,14 +3131,14 @@
         <w:t xml:space="preserve">log in with Discord</w:t>
       </w:r>
       <w:r>
-        <w:t xml:space="preserve"> (no new passwords) and their </w:t>
+        <w:t xml:space="preserve"> (no separate accounts) and their </w:t>
       </w:r>
       <w:r>
         <w:rPr>
           <w:b/>
           <w:bCs/>
         </w:rPr>
-        <w:t xml:space="preserve">Discord roles decide what they see</w:t>
+        <w:t xml:space="preserve">Discord roles determine what they see</w:t>
       </w:r>
       <w:r>
         <w:t xml:space="preserve"> — officers get the admin views, members get their own. This is a placeholder for planning; not yet built.</w:t>
@@ -2685,7 +3660,7 @@
         <w:pStyle w:val="Heading3"/>
       </w:pPr>
       <w:r>
-        <w:t xml:space="preserve">Virus-scan &amp; trust (important for adoption)</w:t>
+        <w:t xml:space="preserve">Virus-scan &amp; trust</w:t>
       </w:r>
     </w:p>
     <w:p>
@@ -2804,7 +3779,7 @@
         <w:spacing w:after="120" w:line="276"/>
       </w:pPr>
       <w:r>
-        <w:t xml:space="preserve">The current plan uses one small cloud server the org runs — simple, cheap and a good fit for a trusted organisation. The architecture also keeps the door open to a </w:t>
+        <w:t xml:space="preserve">The current plan uses one central server the org runs. The architecture also supports a </w:t>
       </w:r>
       <w:r>
         <w:rPr>
@@ -2824,7 +3799,7 @@
         <w:t xml:space="preserve">signed</w:t>
       </w:r>
       <w:r>
-        <w:t xml:space="preserve"> updates so there is no single point of failure, with the cloud server becoming just one node among several and Discord still the front door.</w:t>
+        <w:t xml:space="preserve"> updates so there is no single point of failure, with the cloud server becoming one node among several and Discord still the front door.</w:t>
       </w:r>
     </w:p>
     <w:p>
@@ -2898,10 +3873,10 @@
           <w:b/>
           <w:bCs/>
         </w:rPr>
-        <w:t xml:space="preserve">Recommendation: </w:t>
-      </w:r>
-      <w:r>
-        <w:t xml:space="preserve">treat this as an optional resilience upgrade for later. It is genuinely workable (the cryptographic building blocks already exist in the codebase), but it is a sizeable effort and the org — with trusted leadership — does not need it to get the full value. Revisit only if removing reliance on the single server becomes important, or to federate across multiple orgs.</w:t>
+        <w:t xml:space="preserve">Status: </w:t>
+      </w:r>
+      <w:r>
+        <w:t xml:space="preserve">optional and deferred. The cryptographic building blocks already exist in the codebase (types/Mission.js). It is a sizeable effort and is not required for the current scope. It is revisited only if removing reliance on the single server becomes a requirement, or to federate across multiple orgs (D-004).</w:t>
       </w:r>
     </w:p>
     <w:p>

</xml_diff>

<commit_message>
docs(brief): add corpus findings — player-down detection, mission-type classification, multi-player no-kills confirmation
- status table: player-down (incap) detection, mission-type classification,
  and regression testing now listed as built & tested.
- exec summary + limitations: kills confirmed absent across 193 logs / two
  players / builds 4.7.0-4.8.0; player-down detected as nearest combat outcome.
- section 6: mission-type classifier is built (from generator names), validated
  on the corpus; added a player-downs metric.

Co-Authored-By: Claude Opus 4.8 <noreply@anthropic.com>
</commit_message>
<xml_diff>
--- a/Permafleet-Solution-Brief.docx
+++ b/Permafleet-Solution-Brief.docx
@@ -1299,7 +1299,27 @@
         <w:spacing w:after="120" w:line="276"/>
       </w:pPr>
       <w:r>
-        <w:t xml:space="preserve">Testing established that the current game build (SC 4.8.0) does not record kills or ship destruction, and a player’s own log is self-reported. The register therefore uses </w:t>
+        <w:t xml:space="preserve">Testing across </w:t>
+      </w:r>
+      <w:r>
+        <w:rPr>
+          <w:b/>
+          <w:bCs/>
+        </w:rPr>
+        <w:t xml:space="preserve">193 logs from two players (builds 4.7.0–4.8.0)</w:t>
+      </w:r>
+      <w:r>
+        <w:t xml:space="preserve"> established that the game does not record kills or ship destruction; the nearest combat outcome the log provides is a player going down (</w:t>
+      </w:r>
+      <w:r>
+        <w:rPr>
+          <w:b/>
+          <w:bCs/>
+        </w:rPr>
+        <w:t xml:space="preserve">incapacitation</w:t>
+      </w:r>
+      <w:r>
+        <w:t xml:space="preserve">), which is now detected. A player’s own log is also self-reported. The register therefore uses </w:t>
       </w:r>
       <w:r>
         <w:rPr>
@@ -1722,7 +1742,7 @@
                 <w:sz w:val="19"/>
                 <w:szCs w:val="19"/>
               </w:rPr>
-              <w:t xml:space="preserve">Live activity posted to Discord (one-way webhook)</w:t>
+              <w:t xml:space="preserve">Mission-type classification (Bounty / Mercenary / Mining / …)</w:t>
             </w:r>
           </w:p>
         </w:tc>
@@ -1746,7 +1766,7 @@
                 <w:sz w:val="19"/>
                 <w:szCs w:val="19"/>
               </w:rPr>
-              <w:t xml:space="preserve">Working once connected</w:t>
+              <w:t xml:space="preserve">Built &amp; tested</w:t>
             </w:r>
           </w:p>
         </w:tc>
@@ -1772,7 +1792,7 @@
                 <w:sz w:val="19"/>
                 <w:szCs w:val="19"/>
               </w:rPr>
-              <w:t xml:space="preserve">Mission register engine — create / apply / assign / claim / officer-validate + audit</w:t>
+              <w:t xml:space="preserve">Player-down (incapacitation) detection</w:t>
             </w:r>
           </w:p>
         </w:tc>
@@ -1796,7 +1816,7 @@
                 <w:sz w:val="19"/>
                 <w:szCs w:val="19"/>
               </w:rPr>
-              <w:t xml:space="preserve">Built (engine), proven end-to-end</w:t>
+              <w:t xml:space="preserve">Built &amp; tested</w:t>
             </w:r>
           </w:p>
         </w:tc>
@@ -1822,7 +1842,7 @@
                 <w:sz w:val="19"/>
                 <w:szCs w:val="19"/>
               </w:rPr>
-              <w:t xml:space="preserve">Mission register over a web API</w:t>
+              <w:t xml:space="preserve">Regression testing against real player-log corpus</w:t>
             </w:r>
           </w:p>
         </w:tc>
@@ -1846,7 +1866,7 @@
                 <w:sz w:val="19"/>
                 <w:szCs w:val="19"/>
               </w:rPr>
-              <w:t xml:space="preserve">Next (M5.2)</w:t>
+              <w:t xml:space="preserve">Built &amp; tested</w:t>
             </w:r>
           </w:p>
         </w:tc>
@@ -1872,7 +1892,7 @@
                 <w:sz w:val="19"/>
                 <w:szCs w:val="19"/>
               </w:rPr>
-              <w:t xml:space="preserve">Mission register inside Discord (slash commands + Events hook)</w:t>
+              <w:t xml:space="preserve">Live activity posted to Discord (one-way webhook)</w:t>
             </w:r>
           </w:p>
         </w:tc>
@@ -1896,7 +1916,7 @@
                 <w:sz w:val="19"/>
                 <w:szCs w:val="19"/>
               </w:rPr>
-              <w:t xml:space="preserve">Planned (M5.3)</w:t>
+              <w:t xml:space="preserve">Working once connected</w:t>
             </w:r>
           </w:p>
         </w:tc>
@@ -1922,7 +1942,7 @@
                 <w:sz w:val="19"/>
                 <w:szCs w:val="19"/>
               </w:rPr>
-              <w:t xml:space="preserve">Always-on cloud hosting</w:t>
+              <w:t xml:space="preserve">Mission register engine — create / apply / assign / claim / officer-validate + audit</w:t>
             </w:r>
           </w:p>
         </w:tc>
@@ -1946,7 +1966,7 @@
                 <w:sz w:val="19"/>
                 <w:szCs w:val="19"/>
               </w:rPr>
-              <w:t xml:space="preserve">Planned (M4)</w:t>
+              <w:t xml:space="preserve">Built (engine), proven end-to-end</w:t>
             </w:r>
           </w:p>
         </w:tc>
@@ -1972,6 +1992,156 @@
                 <w:sz w:val="19"/>
                 <w:szCs w:val="19"/>
               </w:rPr>
+              <w:t xml:space="preserve">Mission register over a web API</w:t>
+            </w:r>
+          </w:p>
+        </w:tc>
+        <w:tc>
+          <w:tcPr>
+            <w:tcW w:type="dxa" w:w="2760"/>
+            <w:shd w:fill="FFFFFF" w:val="clear"/>
+            <w:tcMar>
+              <w:top w:type="dxa" w:w="60"/>
+              <w:left w:type="dxa" w:w="110"/>
+              <w:bottom w:type="dxa" w:w="60"/>
+              <w:right w:type="dxa" w:w="110"/>
+            </w:tcMar>
+          </w:tcPr>
+          <w:p>
+            <w:r>
+              <w:rPr>
+                <w:b w:val="false"/>
+                <w:bCs w:val="false"/>
+                <w:color w:val="1a2230"/>
+                <w:sz w:val="19"/>
+                <w:szCs w:val="19"/>
+              </w:rPr>
+              <w:t xml:space="preserve">Next (M5.2)</w:t>
+            </w:r>
+          </w:p>
+        </w:tc>
+      </w:tr>
+      <w:tr>
+        <w:tc>
+          <w:tcPr>
+            <w:tcW w:type="dxa" w:w="6600"/>
+            <w:shd w:fill="FFFFFF" w:val="clear"/>
+            <w:tcMar>
+              <w:top w:type="dxa" w:w="60"/>
+              <w:left w:type="dxa" w:w="110"/>
+              <w:bottom w:type="dxa" w:w="60"/>
+              <w:right w:type="dxa" w:w="110"/>
+            </w:tcMar>
+          </w:tcPr>
+          <w:p>
+            <w:r>
+              <w:rPr>
+                <w:b w:val="false"/>
+                <w:bCs w:val="false"/>
+                <w:color w:val="1a2230"/>
+                <w:sz w:val="19"/>
+                <w:szCs w:val="19"/>
+              </w:rPr>
+              <w:t xml:space="preserve">Mission register inside Discord (slash commands + Events hook)</w:t>
+            </w:r>
+          </w:p>
+        </w:tc>
+        <w:tc>
+          <w:tcPr>
+            <w:tcW w:type="dxa" w:w="2760"/>
+            <w:shd w:fill="FFFFFF" w:val="clear"/>
+            <w:tcMar>
+              <w:top w:type="dxa" w:w="60"/>
+              <w:left w:type="dxa" w:w="110"/>
+              <w:bottom w:type="dxa" w:w="60"/>
+              <w:right w:type="dxa" w:w="110"/>
+            </w:tcMar>
+          </w:tcPr>
+          <w:p>
+            <w:r>
+              <w:rPr>
+                <w:b w:val="false"/>
+                <w:bCs w:val="false"/>
+                <w:color w:val="1a2230"/>
+                <w:sz w:val="19"/>
+                <w:szCs w:val="19"/>
+              </w:rPr>
+              <w:t xml:space="preserve">Planned (M5.3)</w:t>
+            </w:r>
+          </w:p>
+        </w:tc>
+      </w:tr>
+      <w:tr>
+        <w:tc>
+          <w:tcPr>
+            <w:tcW w:type="dxa" w:w="6600"/>
+            <w:shd w:fill="FFFFFF" w:val="clear"/>
+            <w:tcMar>
+              <w:top w:type="dxa" w:w="60"/>
+              <w:left w:type="dxa" w:w="110"/>
+              <w:bottom w:type="dxa" w:w="60"/>
+              <w:right w:type="dxa" w:w="110"/>
+            </w:tcMar>
+          </w:tcPr>
+          <w:p>
+            <w:r>
+              <w:rPr>
+                <w:b w:val="false"/>
+                <w:bCs w:val="false"/>
+                <w:color w:val="1a2230"/>
+                <w:sz w:val="19"/>
+                <w:szCs w:val="19"/>
+              </w:rPr>
+              <w:t xml:space="preserve">Always-on cloud hosting</w:t>
+            </w:r>
+          </w:p>
+        </w:tc>
+        <w:tc>
+          <w:tcPr>
+            <w:tcW w:type="dxa" w:w="2760"/>
+            <w:shd w:fill="FFFFFF" w:val="clear"/>
+            <w:tcMar>
+              <w:top w:type="dxa" w:w="60"/>
+              <w:left w:type="dxa" w:w="110"/>
+              <w:bottom w:type="dxa" w:w="60"/>
+              <w:right w:type="dxa" w:w="110"/>
+            </w:tcMar>
+          </w:tcPr>
+          <w:p>
+            <w:r>
+              <w:rPr>
+                <w:b w:val="false"/>
+                <w:bCs w:val="false"/>
+                <w:color w:val="1a2230"/>
+                <w:sz w:val="19"/>
+                <w:szCs w:val="19"/>
+              </w:rPr>
+              <w:t xml:space="preserve">Planned (M4)</w:t>
+            </w:r>
+          </w:p>
+        </w:tc>
+      </w:tr>
+      <w:tr>
+        <w:tc>
+          <w:tcPr>
+            <w:tcW w:type="dxa" w:w="6600"/>
+            <w:shd w:fill="FFFFFF" w:val="clear"/>
+            <w:tcMar>
+              <w:top w:type="dxa" w:w="60"/>
+              <w:left w:type="dxa" w:w="110"/>
+              <w:bottom w:type="dxa" w:w="60"/>
+              <w:right w:type="dxa" w:w="110"/>
+            </w:tcMar>
+          </w:tcPr>
+          <w:p>
+            <w:r>
+              <w:rPr>
+                <w:b w:val="false"/>
+                <w:bCs w:val="false"/>
+                <w:color w:val="1a2230"/>
+                <w:sz w:val="19"/>
+                <w:szCs w:val="19"/>
+              </w:rPr>
               <w:t xml:space="preserve">Detecting individual kills</w:t>
             </w:r>
           </w:p>
@@ -1996,7 +2166,7 @@
                 <w:sz w:val="19"/>
                 <w:szCs w:val="19"/>
               </w:rPr>
-              <w:t xml:space="preserve">Not possible (game does not log them)</w:t>
+              <w:t xml:space="preserve">Not possible — confirmed across 193 logs, two players, 4.7.0–4.8.0</w:t>
             </w:r>
           </w:p>
         </w:tc>
@@ -2406,7 +2576,7 @@
         <w:spacing w:after="120" w:line="276"/>
       </w:pPr>
       <w:r>
-        <w:t xml:space="preserve">In-game mission types (Bounty, Mercenary/Defense, Hauling, Salvage, Investigation, dynamic events such as XenoThreat) can be inferred from the log and mapped to friendly categories. Org “operations” (e.g. “Tactical Strike Group” — a real announced Star Citizen feature) are officer-named labels that in-game activity rolls up under.</w:t>
+        <w:t xml:space="preserve">In-game mission types (Bounty, Mercenary/Defense, Hauling, Recovery, Mining, FPS/Facility, and others) are classified from the log’s mission generator/template names — built and validated against a 193-log corpus. Org “operations” (e.g. “Tactical Strike Group” — a real announced Star Citizen feature) are officer-named labels that in-game activity rolls up under.</w:t>
       </w:r>
     </w:p>
     <w:p>
@@ -2797,6 +2967,80 @@
                 <w:szCs w:val="19"/>
               </w:rPr>
               <w:t xml:space="preserve">inferred (proxy)</w:t>
+            </w:r>
+          </w:p>
+        </w:tc>
+      </w:tr>
+      <w:tr>
+        <w:tc>
+          <w:tcPr>
+            <w:tcW w:type="dxa" w:w="5200"/>
+            <w:shd w:fill="FFFFFF" w:val="clear"/>
+            <w:tcMar>
+              <w:top w:type="dxa" w:w="60"/>
+              <w:left w:type="dxa" w:w="110"/>
+              <w:bottom w:type="dxa" w:w="60"/>
+              <w:right w:type="dxa" w:w="110"/>
+            </w:tcMar>
+          </w:tcPr>
+          <w:p>
+            <w:r>
+              <w:rPr>
+                <w:b w:val="false"/>
+                <w:bCs w:val="false"/>
+                <w:color w:val="1a2230"/>
+                <w:sz w:val="19"/>
+                <w:szCs w:val="19"/>
+              </w:rPr>
+              <w:t xml:space="preserve">Player-downs (incapacitations) per session / op</w:t>
+            </w:r>
+          </w:p>
+        </w:tc>
+        <w:tc>
+          <w:tcPr>
+            <w:tcW w:type="dxa" w:w="2080"/>
+            <w:shd w:fill="FFFFFF" w:val="clear"/>
+            <w:tcMar>
+              <w:top w:type="dxa" w:w="60"/>
+              <w:left w:type="dxa" w:w="110"/>
+              <w:bottom w:type="dxa" w:w="60"/>
+              <w:right w:type="dxa" w:w="110"/>
+            </w:tcMar>
+          </w:tcPr>
+          <w:p>
+            <w:r>
+              <w:rPr>
+                <w:b w:val="false"/>
+                <w:bCs w:val="false"/>
+                <w:color w:val="1a2230"/>
+                <w:sz w:val="19"/>
+                <w:szCs w:val="19"/>
+              </w:rPr>
+              <w:t xml:space="preserve">relays</w:t>
+            </w:r>
+          </w:p>
+        </w:tc>
+        <w:tc>
+          <w:tcPr>
+            <w:tcW w:type="dxa" w:w="2080"/>
+            <w:shd w:fill="FFFFFF" w:val="clear"/>
+            <w:tcMar>
+              <w:top w:type="dxa" w:w="60"/>
+              <w:left w:type="dxa" w:w="110"/>
+              <w:bottom w:type="dxa" w:w="60"/>
+              <w:right w:type="dxa" w:w="110"/>
+            </w:tcMar>
+          </w:tcPr>
+          <w:p>
+            <w:r>
+              <w:rPr>
+                <w:b w:val="false"/>
+                <w:bCs w:val="false"/>
+                <w:color w:val="1a2230"/>
+                <w:sz w:val="19"/>
+                <w:szCs w:val="19"/>
+              </w:rPr>
+              <w:t xml:space="preserve">inferred</w:t>
             </w:r>
           </w:p>
         </w:tc>
@@ -4640,7 +4884,7 @@
         <w:spacing w:after="60"/>
       </w:pPr>
       <w:r>
-        <w:t xml:space="preserve">Individual kills (PvE or PvP) cannot be detected — the game does not log them.</w:t>
+        <w:t xml:space="preserve">Individual kills (PvE or PvP) cannot be detected — the game does not log them (confirmed across 193 logs, two players, builds 4.7.0–4.8.0). Player-down (incapacitation) is detected as the nearest available combat outcome.</w:t>
       </w:r>
     </w:p>
     <w:p>

</xml_diff>

<commit_message>
fix: correct "no kills" conclusion — kills log for the running player (4.0.2+)
Research + reconciliation against the maintained all-slain parser
(DimmaDont/all-slain, 2025): since SC 4.0.2 the client log records
<Actor Death> CActor::Kill ONLY for kills involving the running player (your
kills/deaths), not third-party kills. The format matches our dormant rules; our
parser passes all-slain's test lines (Bullet + VehicleDestruction). Our corpora
simply had no client-involved kills.

- parser.js: corrected the dormant-rules comment (format corroborated, current).
- tests 43 -> 44 (ship-kill VehicleDestruction variant).
- corrected the framing in memory, both briefs (.md + .docx), REFERENCES.md,
  and PROGRESS.md. Next: capture a real member combat session to flip verified.

Co-Authored-By: Claude Opus 4.8 <noreply@anthropic.com>
</commit_message>
<xml_diff>
--- a/Permafleet-Solution-Brief.docx
+++ b/Permafleet-Solution-Brief.docx
@@ -1309,17 +1309,27 @@
         <w:t xml:space="preserve">193 logs from two players (builds 4.7.0–4.8.0)</w:t>
       </w:r>
       <w:r>
-        <w:t xml:space="preserve"> established that the game does not record kills or ship destruction; the nearest combat outcome the log provides is a player going down (</w:t>
+        <w:t xml:space="preserve"> established that the game records only the kills that </w:t>
       </w:r>
       <w:r>
         <w:rPr>
           <w:b/>
           <w:bCs/>
         </w:rPr>
-        <w:t xml:space="preserve">incapacitation</w:t>
-      </w:r>
-      <w:r>
-        <w:t xml:space="preserve">), which is now detected. A player’s own log is also self-reported. The register therefore uses </w:t>
+        <w:t xml:space="preserve">involve the running player</w:t>
+      </w:r>
+      <w:r>
+        <w:t xml:space="preserve"> (your kills and your deaths) — not third-party kills. The format is corroborated (it matches a maintained community parser) and our parser handles it; our sample logs simply contained no such kills, so an end-to-end capture is still pending. </w:t>
+      </w:r>
+      <w:r>
+        <w:rPr>
+          <w:b/>
+          <w:bCs/>
+        </w:rPr>
+        <w:t xml:space="preserve">Player-downs (incapacitation)</w:t>
+      </w:r>
+      <w:r>
+        <w:t xml:space="preserve"> are also detected. A player’s own log is self-reported, so the register uses </w:t>
       </w:r>
       <w:r>
         <w:rPr>
@@ -1329,7 +1339,7 @@
         <w:t xml:space="preserve">officer validation</w:t>
       </w:r>
       <w:r>
-        <w:t xml:space="preserve"> as the authority for completion, with log activity attached as supporting evidence where it exists. The same model applies to </w:t>
+        <w:t xml:space="preserve"> as the authority for completion, with log activity attached as supporting evidence. The same model applies to </w:t>
       </w:r>
       <w:r>
         <w:rPr>
@@ -2142,7 +2152,7 @@
                 <w:sz w:val="19"/>
                 <w:szCs w:val="19"/>
               </w:rPr>
-              <w:t xml:space="preserve">Detecting individual kills</w:t>
+              <w:t xml:space="preserve">Detect kills involving the running player (your kills + deaths)</w:t>
             </w:r>
           </w:p>
         </w:tc>
@@ -2166,7 +2176,57 @@
                 <w:sz w:val="19"/>
                 <w:szCs w:val="19"/>
               </w:rPr>
-              <w:t xml:space="preserve">Not possible — confirmed across 193 logs, two players, 4.7.0–4.8.0</w:t>
+              <w:t xml:space="preserve">Loggable (SC 4.0.2+); parser matches the format; pending a real combat capture</w:t>
+            </w:r>
+          </w:p>
+        </w:tc>
+      </w:tr>
+      <w:tr>
+        <w:tc>
+          <w:tcPr>
+            <w:tcW w:type="dxa" w:w="6600"/>
+            <w:shd w:fill="FFFFFF" w:val="clear"/>
+            <w:tcMar>
+              <w:top w:type="dxa" w:w="60"/>
+              <w:left w:type="dxa" w:w="110"/>
+              <w:bottom w:type="dxa" w:w="60"/>
+              <w:right w:type="dxa" w:w="110"/>
+            </w:tcMar>
+          </w:tcPr>
+          <w:p>
+            <w:r>
+              <w:rPr>
+                <w:b w:val="false"/>
+                <w:bCs w:val="false"/>
+                <w:color w:val="1a2230"/>
+                <w:sz w:val="19"/>
+                <w:szCs w:val="19"/>
+              </w:rPr>
+              <w:t xml:space="preserve">Detecting third-party kills (others’ fights)</w:t>
+            </w:r>
+          </w:p>
+        </w:tc>
+        <w:tc>
+          <w:tcPr>
+            <w:tcW w:type="dxa" w:w="2760"/>
+            <w:shd w:fill="FFFFFF" w:val="clear"/>
+            <w:tcMar>
+              <w:top w:type="dxa" w:w="60"/>
+              <w:left w:type="dxa" w:w="110"/>
+              <w:bottom w:type="dxa" w:w="60"/>
+              <w:right w:type="dxa" w:w="110"/>
+            </w:tcMar>
+          </w:tcPr>
+          <w:p>
+            <w:r>
+              <w:rPr>
+                <w:b w:val="false"/>
+                <w:bCs w:val="false"/>
+                <w:color w:val="1a2230"/>
+                <w:sz w:val="19"/>
+                <w:szCs w:val="19"/>
+              </w:rPr>
+              <w:t xml:space="preserve">Not possible — the game stopped logging them in 4.0.2</w:t>
             </w:r>
           </w:p>
         </w:tc>
@@ -4884,7 +4944,7 @@
         <w:spacing w:after="60"/>
       </w:pPr>
       <w:r>
-        <w:t xml:space="preserve">Individual kills (PvE or PvP) cannot be detected — the game does not log them (confirmed across 193 logs, two players, builds 4.7.0–4.8.0). Player-down (incapacitation) is detected as the nearest available combat outcome.</w:t>
+        <w:t xml:space="preserve">Only kills that involve the running player are logged (since SC 4.0.2) — your kills and your deaths; third-party kills are not. The format is corroborated (it matches the maintained all-slain parser) and our parser handles it, but we have not yet captured a real member combat session to confirm end-to-end. Player-down (incapacitation) is also detected.</w:t>
       </w:r>
     </w:p>
     <w:p>

</xml_diff>

<commit_message>
feat: VERIFY kills/vehicle-destruction on real member data (417 kills)
A 3rd member corpus (Fadingdoughnut0, 332 files / 9.6 GB, 4.2.x-4.8.0) finally
contained client-involved combat. Full scan: 5 files with kills; our parser
caught ALL 417 <Actor Death> CActor::Kill lines (414 kills + 3 deaths, 394 NPC
victims; 8 damage types) + 16 <Vehicle Destruction> lines (DRAK_Corsair ->
"Corsair").

- parser: flipped kill + vehicle:destroy rules to verified:true; updated comment.
- tests: the three combat assertions now expect verified:true (45 pass).
- corrected memory, both briefs (.md + .docx), REFERENCES.md, PROGRESS.md.

The headline feature (kills -> dashboard/Discord) is real for member-involved
combat. Third-party kills remain unlogged (SC 4.0.2).

Co-Authored-By: Claude Opus 4.8 <noreply@anthropic.com>
</commit_message>
<xml_diff>
--- a/Permafleet-Solution-Brief.docx
+++ b/Permafleet-Solution-Brief.docx
@@ -1319,7 +1319,17 @@
         <w:t xml:space="preserve">involve the running player</w:t>
       </w:r>
       <w:r>
-        <w:t xml:space="preserve"> (your kills and your deaths) — not third-party kills. The format is corroborated (it matches a maintained community parser) and our parser handles it; our sample logs simply contained no such kills, so an end-to-end capture is still pending. </w:t>
+        <w:t xml:space="preserve"> (your kills and your deaths) — not third-party kills. This is now </w:t>
+      </w:r>
+      <w:r>
+        <w:rPr>
+          <w:b/>
+          <w:bCs/>
+        </w:rPr>
+        <w:t xml:space="preserve">verified end-to-end against a member’s real logs</w:t>
+      </w:r>
+      <w:r>
+        <w:t xml:space="preserve"> (417 kills + 16 ship destructions parsed correctly). </w:t>
       </w:r>
       <w:r>
         <w:rPr>
@@ -2176,7 +2186,7 @@
                 <w:sz w:val="19"/>
                 <w:szCs w:val="19"/>
               </w:rPr>
-              <w:t xml:space="preserve">Loggable (SC 4.0.2+); parser matches the format; pending a real combat capture</w:t>
+              <w:t xml:space="preserve">Built &amp; verified — 417 real kills + 16 ship destructions from a member’s logs</w:t>
             </w:r>
           </w:p>
         </w:tc>
@@ -4944,7 +4954,7 @@
         <w:spacing w:after="60"/>
       </w:pPr>
       <w:r>
-        <w:t xml:space="preserve">Only kills that involve the running player are logged (since SC 4.0.2) — your kills and your deaths; third-party kills are not. The format is corroborated (it matches the maintained all-slain parser) and our parser handles it, but we have not yet captured a real member combat session to confirm end-to-end. Player-down (incapacitation) is also detected.</w:t>
+        <w:t xml:space="preserve">Only kills that involve the running player are logged (since SC 4.0.2) — your kills and your deaths; third-party kills are not. This is verified end-to-end against a member’s real logs (417 kills + 16 ship destructions parsed correctly). Player-down (incapacitation) is also detected.</w:t>
       </w:r>
     </w:p>
     <w:p>

</xml_diff>

<commit_message>
fix: kill logging was REMOVED after SC 4.3.0 — not in current game
Double-checked the verified kills against build versions. ALL 417 kills are
from 4.2.1/4.3.0 (Aug-Sep 2025). Mapped all 26 builds: 4.3.2 -> 4.8.0 have ZERO
kills across ~290 files. Largest 4.7/4.8 sessions: 0 CActor::Kill / 0 "killed by"
yet 1660 combat-mission refs + 3125 corpse-creation lines (combat + deaths
happened, kills not logged). Corroborated by DeadMan-4.7.0 + Kersa-4.8.0.

Conclusion: CIG removed/moved kill logging after 4.3.0; the live kill feed does
NOT work on current builds. Rules kept (parse historical <=4.3.0 logs correctly;
verified:true = format-confirmed, not a current-availability claim).

- corrected parser comment, memory, both briefs (.md+.docx), REFERENCES, PROGRESS.
- player-down (incap) detection is unaffected and remains the current-build signal.

Co-Authored-By: Claude Opus 4.8 <noreply@anthropic.com>
</commit_message>
<xml_diff>
--- a/Permafleet-Solution-Brief.docx
+++ b/Permafleet-Solution-Brief.docx
@@ -1319,17 +1319,27 @@
         <w:t xml:space="preserve">involve the running player</w:t>
       </w:r>
       <w:r>
-        <w:t xml:space="preserve"> (your kills and your deaths) — not third-party kills. This is now </w:t>
+        <w:t xml:space="preserve"> (your kills and your deaths) — not third-party kills. Our parser was </w:t>
       </w:r>
       <w:r>
         <w:rPr>
           <w:b/>
           <w:bCs/>
         </w:rPr>
-        <w:t xml:space="preserve">verified end-to-end against a member’s real logs</w:t>
-      </w:r>
-      <w:r>
-        <w:t xml:space="preserve"> (417 kills + 16 ship destructions parsed correctly). </w:t>
+        <w:t xml:space="preserve">verified on 417 real kills</w:t>
+      </w:r>
+      <w:r>
+        <w:t xml:space="preserve"> from a member’s logs — but only in SC ≤ 4.3.0; </w:t>
+      </w:r>
+      <w:r>
+        <w:rPr>
+          <w:b/>
+          <w:bCs/>
+        </w:rPr>
+        <w:t xml:space="preserve">CIG removed kill logging after 4.3.0</w:t>
+      </w:r>
+      <w:r>
+        <w:t xml:space="preserve">, so it is not available in the current game (confirmed across ~290 later files from three players). </w:t>
       </w:r>
       <w:r>
         <w:rPr>
@@ -2162,7 +2172,7 @@
                 <w:sz w:val="19"/>
                 <w:szCs w:val="19"/>
               </w:rPr>
-              <w:t xml:space="preserve">Detect kills involving the running player (your kills + deaths)</w:t>
+              <w:t xml:space="preserve">Kill detection (your kills/deaths) — historical logs only</w:t>
             </w:r>
           </w:p>
         </w:tc>
@@ -2186,7 +2196,7 @@
                 <w:sz w:val="19"/>
                 <w:szCs w:val="19"/>
               </w:rPr>
-              <w:t xml:space="preserve">Built &amp; verified — 417 real kills + 16 ship destructions from a member’s logs</w:t>
+              <w:t xml:space="preserve">Parser verified on 417 real kills (SC ≤ 4.3.0); CIG removed kill logging after 4.3.0 — not in current builds</w:t>
             </w:r>
           </w:p>
         </w:tc>
@@ -4954,7 +4964,7 @@
         <w:spacing w:after="60"/>
       </w:pPr>
       <w:r>
-        <w:t xml:space="preserve">Only kills that involve the running player are logged (since SC 4.0.2) — your kills and your deaths; third-party kills are not. This is verified end-to-end against a member’s real logs (417 kills + 16 ship destructions parsed correctly). Player-down (incapacitation) is also detected.</w:t>
+        <w:t xml:space="preserve">Kill logging was removed by CIG after SC 4.3.0. Our parser is verified on 417 real kills from ≤4.3.0 logs, but the current game (4.8.0) logs no kills at all — confirmed across ~290 later files from three players (combat happened, no kill lines). Player-down (incapacitation) IS still detected in current builds.</w:t>
       </w:r>
     </w:p>
     <w:p>

</xml_diff>